<commit_message>
added theotokion troparia insertion
</commit_message>
<xml_diff>
--- a/flow/20230914_vu_template/drafts/2023-11-g/01-СР-свсмч.Теодора Ромжі.docx
+++ b/flow/20230914_vu_template/drafts/2023-11-g/01-СР-свсмч.Теодора Ромжі.docx
@@ -4725,7 +4725,7 @@
     </w:p>
     <w:p>
       <w:pPr>
-        <w:pStyle w:val="Heading3"/>
+        <w:pStyle w:val="3"/>
       </w:pPr>
       <w:r>
         <w:rPr>
@@ -4738,7 +4738,9 @@
       </w:r>
     </w:p>
     <w:p>
-      <w:pPr/>
+      <w:pPr>
+        <w:pStyle w:val="a"/>
+      </w:pPr>
       <w:r>
         <w:rPr>
           <w:rFonts w:ascii="Times New Roman" w:hAnsi="Times New Roman"/>
@@ -4804,7 +4806,9 @@
       </w:r>
     </w:p>
     <w:p>
-      <w:pPr/>
+      <w:pPr>
+        <w:pStyle w:val="a"/>
+      </w:pPr>
       <w:r>
         <w:rPr>
           <w:rFonts w:ascii="Times New Roman" w:hAnsi="Times New Roman"/>
@@ -4996,7 +5000,9 @@
       </w:r>
     </w:p>
     <w:p>
-      <w:pPr/>
+      <w:pPr>
+        <w:pStyle w:val="a"/>
+      </w:pPr>
       <w:r>
         <w:rPr>
           <w:rFonts w:ascii="Times New Roman" w:hAnsi="Times New Roman"/>

</xml_diff>